<commit_message>
CORRECTION : correction Algorithme Trie par Sélection
</commit_message>
<xml_diff>
--- a/07-Tableaux_2D.docx
+++ b/07-Tableaux_2D.docx
@@ -12,15 +12,7 @@
     </w:p>
     <w:p>
       <w:r>
-        <w:t xml:space="preserve">Créer un tableau 3×3 </w:t>
-      </w:r>
-      <w:proofErr w:type="gramStart"/>
-      <w:r>
-        <w:t>représentant</w:t>
-      </w:r>
-      <w:proofErr w:type="gramEnd"/>
-      <w:r>
-        <w:t xml:space="preserve"> une grille de morpion. </w:t>
+        <w:t xml:space="preserve">Créer un tableau 3×3 représentant une grille de morpion. </w:t>
       </w:r>
     </w:p>
     <w:p>
@@ -68,31 +60,18 @@
       <w:r>
         <w:t xml:space="preserve">     </w:t>
       </w:r>
-      <w:proofErr w:type="gramStart"/>
-      <w:r>
-        <w:t>morpion</w:t>
-      </w:r>
-      <w:proofErr w:type="gramEnd"/>
-      <w:r>
-        <w:t xml:space="preserve"> &lt;- [</w:t>
+      <w:r>
+        <w:t>morpion &lt;- [</w:t>
       </w:r>
       <w:r>
         <w:br/>
         <w:t xml:space="preserve">              </w:t>
       </w:r>
       <w:r>
-        <w:t xml:space="preserve"> </w:t>
-      </w:r>
-      <w:proofErr w:type="gramStart"/>
-      <w:r>
-        <w:t xml:space="preserve">   </w:t>
-      </w:r>
-      <w:r>
-        <w:t>[</w:t>
-      </w:r>
-      <w:proofErr w:type="gramEnd"/>
-      <w:r>
-        <w:t>‘</w:t>
+        <w:t xml:space="preserve">    </w:t>
+      </w:r>
+      <w:r>
+        <w:t>[‘</w:t>
       </w:r>
       <w:r>
         <w:t xml:space="preserve"> </w:t>
@@ -117,18 +96,10 @@
         <w:t xml:space="preserve">              </w:t>
       </w:r>
       <w:r>
-        <w:t xml:space="preserve"> </w:t>
-      </w:r>
-      <w:proofErr w:type="gramStart"/>
-      <w:r>
-        <w:t xml:space="preserve">   </w:t>
-      </w:r>
-      <w:r>
-        <w:t>[</w:t>
-      </w:r>
-      <w:proofErr w:type="gramEnd"/>
-      <w:r>
-        <w:t>‘</w:t>
+        <w:t xml:space="preserve">    </w:t>
+      </w:r>
+      <w:r>
+        <w:t>[‘</w:t>
       </w:r>
       <w:r>
         <w:t xml:space="preserve"> </w:t>
@@ -153,18 +124,10 @@
         <w:t xml:space="preserve">              </w:t>
       </w:r>
       <w:r>
-        <w:t xml:space="preserve"> </w:t>
-      </w:r>
-      <w:proofErr w:type="gramStart"/>
-      <w:r>
-        <w:t xml:space="preserve">   </w:t>
-      </w:r>
-      <w:r>
-        <w:t>[</w:t>
-      </w:r>
-      <w:proofErr w:type="gramEnd"/>
-      <w:r>
-        <w:t>‘</w:t>
+        <w:t xml:space="preserve">    </w:t>
+      </w:r>
+      <w:r>
+        <w:t>[‘</w:t>
       </w:r>
       <w:r>
         <w:t xml:space="preserve"> </w:t>
@@ -189,16 +152,11 @@
         <w:t xml:space="preserve">           </w:t>
       </w:r>
       <w:r>
-        <w:t xml:space="preserve">   </w:t>
-      </w:r>
-      <w:proofErr w:type="gramStart"/>
-      <w:r>
-        <w:t xml:space="preserve">  </w:t>
+        <w:t xml:space="preserve">     </w:t>
       </w:r>
       <w:r>
         <w:t>]</w:t>
       </w:r>
-      <w:proofErr w:type="gramEnd"/>
       <w:r>
         <w:br/>
       </w:r>
@@ -211,23 +169,7 @@
         <w:t xml:space="preserve">     </w:t>
       </w:r>
       <w:r>
-        <w:t>// morpion[</w:t>
-      </w:r>
-      <w:proofErr w:type="spellStart"/>
-      <w:r>
-        <w:t>indexLigne</w:t>
-      </w:r>
-      <w:proofErr w:type="spellEnd"/>
-      <w:r>
-        <w:t>][</w:t>
-      </w:r>
-      <w:proofErr w:type="spellStart"/>
-      <w:r>
-        <w:t>indexColone</w:t>
-      </w:r>
-      <w:proofErr w:type="spellEnd"/>
-      <w:r>
-        <w:t>] &lt;- valeur</w:t>
+        <w:t>// morpion[indexLigne][indexColone] &lt;- valeur</w:t>
       </w:r>
     </w:p>
     <w:p>
@@ -237,13 +179,8 @@
       <w:r>
         <w:t xml:space="preserve">     </w:t>
       </w:r>
-      <w:proofErr w:type="gramStart"/>
-      <w:r>
-        <w:t>morpion[</w:t>
-      </w:r>
-      <w:proofErr w:type="gramEnd"/>
-      <w:r>
-        <w:t xml:space="preserve">1][1] &lt;- </w:t>
+      <w:r>
+        <w:t xml:space="preserve">morpion[1][1] &lt;- </w:t>
       </w:r>
       <w:r>
         <w:t>‘X’</w:t>
@@ -256,13 +193,8 @@
       <w:r>
         <w:t xml:space="preserve">     </w:t>
       </w:r>
-      <w:proofErr w:type="gramStart"/>
-      <w:r>
-        <w:t>morpion[</w:t>
-      </w:r>
-      <w:proofErr w:type="gramEnd"/>
-      <w:r>
-        <w:t xml:space="preserve">0][2] &lt;- </w:t>
+      <w:r>
+        <w:t xml:space="preserve">morpion[0][2] &lt;- </w:t>
       </w:r>
       <w:r>
         <w:t>‘</w:t>
@@ -281,13 +213,8 @@
       <w:r>
         <w:t xml:space="preserve">     </w:t>
       </w:r>
-      <w:proofErr w:type="gramStart"/>
-      <w:r>
-        <w:t>morpion[</w:t>
-      </w:r>
-      <w:proofErr w:type="gramEnd"/>
-      <w:r>
-        <w:t xml:space="preserve">0][1] &lt;- </w:t>
+      <w:r>
+        <w:t xml:space="preserve">morpion[0][1] &lt;- </w:t>
       </w:r>
       <w:r>
         <w:t>‘</w:t>
@@ -304,15 +231,7 @@
         <w:pStyle w:val="Code"/>
       </w:pPr>
       <w:r>
-        <w:t xml:space="preserve">     </w:t>
-      </w:r>
-      <w:proofErr w:type="gramStart"/>
-      <w:r>
-        <w:t>morpion[</w:t>
-      </w:r>
-      <w:proofErr w:type="gramEnd"/>
-      <w:r>
-        <w:t>2][1] &lt;- ‘O’</w:t>
+        <w:t xml:space="preserve">     morpion[2][1] &lt;- ‘O’</w:t>
       </w:r>
     </w:p>
     <w:p>
@@ -320,15 +239,7 @@
         <w:pStyle w:val="Code"/>
       </w:pPr>
       <w:r>
-        <w:t xml:space="preserve">     </w:t>
-      </w:r>
-      <w:proofErr w:type="gramStart"/>
-      <w:r>
-        <w:t>morpion[</w:t>
-      </w:r>
-      <w:proofErr w:type="gramEnd"/>
-      <w:r>
-        <w:t>2][2] &lt;- ‘X’</w:t>
+        <w:t xml:space="preserve">     morpion[2][2] &lt;- ‘X’</w:t>
       </w:r>
       <w:r>
         <w:br/>
@@ -394,15 +305,7 @@
         <w:t>er</w:t>
       </w:r>
       <w:r>
-        <w:t xml:space="preserve"> Tour :</w:t>
-      </w:r>
-      <w:proofErr w:type="gramStart"/>
-      <w:r>
-        <w:t xml:space="preserve">   [</w:t>
-      </w:r>
-      <w:proofErr w:type="gramEnd"/>
-      <w:r>
-        <w:t>‘ ’,’X’,’O’]</w:t>
+        <w:t xml:space="preserve"> Tour :   [‘ ’,’X’,’O’]</w:t>
       </w:r>
     </w:p>
     <w:p>
@@ -491,63 +394,23 @@
         </w:numPr>
       </w:pPr>
       <w:r>
-        <w:t xml:space="preserve">     </w:t>
-      </w:r>
-      <w:proofErr w:type="gramStart"/>
-      <w:r>
-        <w:t>classes</w:t>
-      </w:r>
-      <w:proofErr w:type="gramEnd"/>
-      <w:r>
-        <w:t xml:space="preserve"> &lt;- [</w:t>
+        <w:t xml:space="preserve">     classes &lt;- [</w:t>
       </w:r>
       <w:r>
         <w:br/>
-        <w:t xml:space="preserve">                 </w:t>
-      </w:r>
-      <w:proofErr w:type="gramStart"/>
-      <w:r>
-        <w:t xml:space="preserve">   [</w:t>
-      </w:r>
-      <w:proofErr w:type="gramEnd"/>
-      <w:r>
-        <w:t>12, 18, 7, 14, 13],</w:t>
+        <w:t xml:space="preserve">                    [12, 18, 7, 14, 13],</w:t>
       </w:r>
       <w:r>
         <w:br/>
-        <w:t xml:space="preserve">                 </w:t>
-      </w:r>
-      <w:proofErr w:type="gramStart"/>
-      <w:r>
-        <w:t xml:space="preserve">   [</w:t>
-      </w:r>
-      <w:proofErr w:type="gramEnd"/>
-      <w:r>
-        <w:t>16, 17, 15, 19, 17],</w:t>
+        <w:t xml:space="preserve">                    [16, 17, 15, 19, 17],</w:t>
       </w:r>
       <w:r>
         <w:br/>
-        <w:t xml:space="preserve">                 </w:t>
-      </w:r>
-      <w:proofErr w:type="gramStart"/>
-      <w:r>
-        <w:t xml:space="preserve">   [</w:t>
-      </w:r>
-      <w:proofErr w:type="gramEnd"/>
-      <w:r>
-        <w:t>6, 7, 12, 14, 9]</w:t>
+        <w:t xml:space="preserve">                    [6, 7, 12, 14, 9]</w:t>
       </w:r>
       <w:r>
         <w:br/>
-        <w:t xml:space="preserve">              </w:t>
-      </w:r>
-      <w:proofErr w:type="gramStart"/>
-      <w:r>
-        <w:t xml:space="preserve">  ]</w:t>
-      </w:r>
-      <w:proofErr w:type="gramEnd"/>
-      <w:r>
-        <w:t xml:space="preserve"> </w:t>
+        <w:t xml:space="preserve">                ] </w:t>
       </w:r>
     </w:p>
     <w:p>
@@ -595,15 +458,7 @@
         </w:numPr>
       </w:pPr>
       <w:r>
-        <w:t xml:space="preserve">        </w:t>
-      </w:r>
-      <w:proofErr w:type="gramStart"/>
-      <w:r>
-        <w:t>somme</w:t>
-      </w:r>
-      <w:proofErr w:type="gramEnd"/>
-      <w:r>
-        <w:t xml:space="preserve"> &lt;- 0</w:t>
+        <w:t xml:space="preserve">        somme &lt;- 0</w:t>
       </w:r>
     </w:p>
     <w:p>
@@ -627,15 +482,7 @@
         </w:numPr>
       </w:pPr>
       <w:r>
-        <w:t xml:space="preserve">           </w:t>
-      </w:r>
-      <w:proofErr w:type="gramStart"/>
-      <w:r>
-        <w:t>somme</w:t>
-      </w:r>
-      <w:proofErr w:type="gramEnd"/>
-      <w:r>
-        <w:t xml:space="preserve"> &lt;- somme + </w:t>
+        <w:t xml:space="preserve">           somme &lt;- somme + </w:t>
       </w:r>
       <w:r>
         <w:t>tableau</w:t>
@@ -665,15 +512,7 @@
         </w:numPr>
       </w:pPr>
       <w:r>
-        <w:t xml:space="preserve">        </w:t>
-      </w:r>
-      <w:proofErr w:type="gramStart"/>
-      <w:r>
-        <w:t>moyenne</w:t>
-      </w:r>
-      <w:proofErr w:type="gramEnd"/>
-      <w:r>
-        <w:t xml:space="preserve"> &lt;- somme / nombre d’élément tableau</w:t>
+        <w:t xml:space="preserve">        moyenne &lt;- somme / nombre d’élément tableau</w:t>
       </w:r>
     </w:p>
     <w:p>
@@ -712,23 +551,7 @@
         </w:numPr>
       </w:pPr>
       <w:r>
-        <w:t xml:space="preserve">SOUS-ALGORITHME </w:t>
-      </w:r>
-      <w:proofErr w:type="spellStart"/>
-      <w:r>
-        <w:t>moyenneClasses</w:t>
-      </w:r>
-      <w:proofErr w:type="spellEnd"/>
-      <w:r>
-        <w:t>(</w:t>
-      </w:r>
-      <w:proofErr w:type="spellStart"/>
-      <w:r>
-        <w:t>tableauClasses</w:t>
-      </w:r>
-      <w:proofErr w:type="spellEnd"/>
-      <w:r>
-        <w:t>)</w:t>
+        <w:t>SOUS-ALGORITHME moyenneClasses(tableauClasses)</w:t>
       </w:r>
     </w:p>
     <w:p>
@@ -740,15 +563,7 @@
         </w:numPr>
       </w:pPr>
       <w:r>
-        <w:t xml:space="preserve">   // Il faut parcourir un tableau de Classes. A chaque tour, on appelle le sous-</w:t>
-      </w:r>
-      <w:proofErr w:type="spellStart"/>
-      <w:r>
-        <w:t>alorithme</w:t>
-      </w:r>
-      <w:proofErr w:type="spellEnd"/>
-      <w:r>
-        <w:t xml:space="preserve"> moyenne sur le tableau de note contenu sur une ligne</w:t>
+        <w:t xml:space="preserve">   // Il faut parcourir un tableau de Classes. A chaque tour, on appelle le sous-alorithme moyenne sur le tableau de note contenu sur une ligne</w:t>
       </w:r>
       <w:r>
         <w:t>, puis ajouter cette moyenne à un accumulateur somme. Enfin, on calcul la moyenne en divisant par la taille du tableau de Classe</w:t>
@@ -763,15 +578,7 @@
         </w:numPr>
       </w:pPr>
       <w:r>
-        <w:t xml:space="preserve">   </w:t>
-      </w:r>
-      <w:proofErr w:type="gramStart"/>
-      <w:r>
-        <w:t>somme</w:t>
-      </w:r>
-      <w:proofErr w:type="gramEnd"/>
-      <w:r>
-        <w:t xml:space="preserve"> &lt;- 0</w:t>
+        <w:t xml:space="preserve">   somme &lt;- 0</w:t>
       </w:r>
     </w:p>
     <w:p>
@@ -783,15 +590,7 @@
         </w:numPr>
       </w:pPr>
       <w:r>
-        <w:t xml:space="preserve">   POUR i de 0 à taille de </w:t>
-      </w:r>
-      <w:proofErr w:type="spellStart"/>
-      <w:r>
-        <w:t>tableauClasses</w:t>
-      </w:r>
-      <w:proofErr w:type="spellEnd"/>
-      <w:r>
-        <w:t xml:space="preserve"> – 1</w:t>
+        <w:t xml:space="preserve">   POUR i de 0 à taille de tableauClasses – 1</w:t>
       </w:r>
     </w:p>
     <w:p>
@@ -803,23 +602,7 @@
         </w:numPr>
       </w:pPr>
       <w:r>
-        <w:t xml:space="preserve">      </w:t>
-      </w:r>
-      <w:proofErr w:type="gramStart"/>
-      <w:r>
-        <w:t>somme</w:t>
-      </w:r>
-      <w:proofErr w:type="gramEnd"/>
-      <w:r>
-        <w:t xml:space="preserve"> &lt;- somme + moyenne(</w:t>
-      </w:r>
-      <w:proofErr w:type="spellStart"/>
-      <w:r>
-        <w:t>tableauClasses</w:t>
-      </w:r>
-      <w:proofErr w:type="spellEnd"/>
-      <w:r>
-        <w:t>[i])</w:t>
+        <w:t xml:space="preserve">      somme &lt;- somme + moyenne(tableauClasses[i])</w:t>
       </w:r>
     </w:p>
     <w:p>
@@ -843,27 +626,14 @@
         </w:numPr>
       </w:pPr>
       <w:r>
-        <w:t xml:space="preserve">   </w:t>
-      </w:r>
-      <w:proofErr w:type="gramStart"/>
-      <w:r>
-        <w:t>moyenne</w:t>
-      </w:r>
-      <w:proofErr w:type="gramEnd"/>
-      <w:r>
-        <w:t xml:space="preserve"> &lt;-</w:t>
+        <w:t xml:space="preserve">   moyenne &lt;-</w:t>
       </w:r>
       <w:r>
         <w:t xml:space="preserve"> </w:t>
       </w:r>
       <w:r>
-        <w:t xml:space="preserve">somme / nombre d’élément de </w:t>
-      </w:r>
-      <w:proofErr w:type="spellStart"/>
-      <w:r>
-        <w:t>tableauClasses</w:t>
-      </w:r>
-      <w:proofErr w:type="spellEnd"/>
+        <w:t>somme / nombre d’élément de tableauClasses</w:t>
+      </w:r>
     </w:p>
     <w:p>
       <w:pPr>
@@ -943,23 +713,8 @@
           <w:numId w:val="52"/>
         </w:numPr>
       </w:pPr>
-      <w:proofErr w:type="spellStart"/>
-      <w:proofErr w:type="gramStart"/>
-      <w:r>
-        <w:t>moyennePremiereClasse</w:t>
-      </w:r>
-      <w:proofErr w:type="spellEnd"/>
-      <w:proofErr w:type="gramEnd"/>
-      <w:r>
-        <w:t xml:space="preserve"> &lt;- moyenne(</w:t>
-      </w:r>
-      <w:proofErr w:type="gramStart"/>
-      <w:r>
-        <w:t>classes[</w:t>
-      </w:r>
-      <w:proofErr w:type="gramEnd"/>
-      <w:r>
-        <w:t>0])</w:t>
+      <w:r>
+        <w:t>moyennePremiereClasse &lt;- moyenne(classes[0])</w:t>
       </w:r>
       <w:r>
         <w:br/>
@@ -980,21 +735,8 @@
         <w:br/>
         <w:t xml:space="preserve">     </w:t>
       </w:r>
-      <w:proofErr w:type="spellStart"/>
-      <w:r>
-        <w:t>classesGeneral</w:t>
-      </w:r>
-      <w:proofErr w:type="spellEnd"/>
-      <w:r>
-        <w:t xml:space="preserve"> &lt;- </w:t>
-      </w:r>
-      <w:proofErr w:type="spellStart"/>
-      <w:r>
-        <w:t>moyenneClasses</w:t>
-      </w:r>
-      <w:proofErr w:type="spellEnd"/>
-      <w:r>
-        <w:t>(classes)</w:t>
+      <w:r>
+        <w:t>classesGeneral &lt;- moyenneClasses(classes)</w:t>
       </w:r>
     </w:p>
     <w:p>
@@ -1056,29 +798,15 @@
         </w:numPr>
       </w:pPr>
       <w:r>
-        <w:t xml:space="preserve">     </w:t>
-      </w:r>
-      <w:proofErr w:type="gramStart"/>
-      <w:r>
-        <w:t>tableau</w:t>
-      </w:r>
-      <w:proofErr w:type="gramEnd"/>
-      <w:r>
-        <w:t xml:space="preserve"> &lt;- [</w:t>
+        <w:t xml:space="preserve">     tableau &lt;- [</w:t>
       </w:r>
       <w:r>
         <w:br/>
-        <w:t xml:space="preserve">                </w:t>
-      </w:r>
-      <w:proofErr w:type="gramStart"/>
-      <w:r>
-        <w:t xml:space="preserve">   [</w:t>
-      </w:r>
-      <w:proofErr w:type="gramEnd"/>
+        <w:t xml:space="preserve">                   [</w:t>
+      </w:r>
       <w:r>
         <w:t xml:space="preserve"> </w:t>
       </w:r>
-      <w:proofErr w:type="gramStart"/>
       <w:r>
         <w:t xml:space="preserve">1, </w:t>
       </w:r>
@@ -1098,25 +826,15 @@
         <w:t xml:space="preserve"> </w:t>
       </w:r>
       <w:r>
-        <w:t>4</w:t>
-      </w:r>
-      <w:proofErr w:type="gramEnd"/>
-      <w:r>
-        <w:t>],</w:t>
+        <w:t>4],</w:t>
       </w:r>
       <w:r>
         <w:br/>
-        <w:t xml:space="preserve">                </w:t>
-      </w:r>
-      <w:proofErr w:type="gramStart"/>
-      <w:r>
-        <w:t xml:space="preserve">   [</w:t>
-      </w:r>
-      <w:proofErr w:type="gramEnd"/>
+        <w:t xml:space="preserve">                   [</w:t>
+      </w:r>
       <w:r>
         <w:t xml:space="preserve"> </w:t>
       </w:r>
-      <w:proofErr w:type="gramStart"/>
       <w:r>
         <w:t xml:space="preserve">5, </w:t>
       </w:r>
@@ -1136,25 +854,15 @@
         <w:t xml:space="preserve"> </w:t>
       </w:r>
       <w:r>
-        <w:t>7</w:t>
-      </w:r>
-      <w:proofErr w:type="gramEnd"/>
-      <w:r>
-        <w:t>],</w:t>
+        <w:t>7],</w:t>
       </w:r>
       <w:r>
         <w:br/>
-        <w:t xml:space="preserve">                </w:t>
-      </w:r>
-      <w:proofErr w:type="gramStart"/>
-      <w:r>
-        <w:t xml:space="preserve">   [</w:t>
-      </w:r>
-      <w:proofErr w:type="gramEnd"/>
+        <w:t xml:space="preserve">                   [</w:t>
+      </w:r>
       <w:r>
         <w:t xml:space="preserve"> </w:t>
       </w:r>
-      <w:proofErr w:type="gramStart"/>
       <w:r>
         <w:t xml:space="preserve">8, </w:t>
       </w:r>
@@ -1167,34 +875,20 @@
       <w:r>
         <w:t xml:space="preserve">  </w:t>
       </w:r>
-      <w:proofErr w:type="gramEnd"/>
       <w:r>
         <w:t>6, 14],</w:t>
       </w:r>
       <w:r>
         <w:br/>
-        <w:t xml:space="preserve">                </w:t>
-      </w:r>
-      <w:proofErr w:type="gramStart"/>
-      <w:r>
-        <w:t xml:space="preserve">   [</w:t>
-      </w:r>
-      <w:r>
-        <w:t>11,  12,  15</w:t>
-      </w:r>
-      <w:proofErr w:type="gramEnd"/>
-      <w:r>
-        <w:t>, 16]</w:t>
+        <w:t xml:space="preserve">                   [</w:t>
+      </w:r>
+      <w:r>
+        <w:t>11,  12,  15, 16]</w:t>
       </w:r>
       <w:r>
         <w:br/>
-        <w:t xml:space="preserve">              </w:t>
-      </w:r>
-      <w:proofErr w:type="gramStart"/>
-      <w:r>
-        <w:t xml:space="preserve">  ]</w:t>
-      </w:r>
-      <w:proofErr w:type="gramEnd"/>
+        <w:t xml:space="preserve">                ]</w:t>
+      </w:r>
       <w:r>
         <w:br/>
       </w:r>
@@ -1208,15 +902,7 @@
         </w:numPr>
       </w:pPr>
       <w:r>
-        <w:t xml:space="preserve">     </w:t>
-      </w:r>
-      <w:proofErr w:type="gramStart"/>
-      <w:r>
-        <w:t>nombre</w:t>
-      </w:r>
-      <w:proofErr w:type="gramEnd"/>
-      <w:r>
-        <w:t xml:space="preserve"> &lt;- le nombre à chercher</w:t>
+        <w:t xml:space="preserve">     nombre &lt;- le nombre à chercher</w:t>
       </w:r>
       <w:r>
         <w:br/>
@@ -1237,21 +923,7 @@
         <w:rPr>
           <w:color w:val="00B050"/>
         </w:rPr>
-        <w:t>//</w:t>
-      </w:r>
-      <w:proofErr w:type="spellStart"/>
-      <w:r>
-        <w:rPr>
-          <w:color w:val="00B050"/>
-        </w:rPr>
-        <w:t>estTrouve</w:t>
-      </w:r>
-      <w:proofErr w:type="spellEnd"/>
-      <w:r>
-        <w:rPr>
-          <w:color w:val="00B050"/>
-        </w:rPr>
-        <w:t xml:space="preserve"> permet de savoir si le nombre a été trouvé</w:t>
+        <w:t>//estTrouve permet de savoir si le nombre a été trouvé</w:t>
       </w:r>
     </w:p>
     <w:p>
@@ -1263,17 +935,7 @@
         </w:numPr>
       </w:pPr>
       <w:r>
-        <w:t xml:space="preserve">     </w:t>
-      </w:r>
-      <w:proofErr w:type="spellStart"/>
-      <w:proofErr w:type="gramStart"/>
-      <w:r>
-        <w:t>estTrouve</w:t>
-      </w:r>
-      <w:proofErr w:type="spellEnd"/>
-      <w:proofErr w:type="gramEnd"/>
-      <w:r>
-        <w:t xml:space="preserve"> &lt;- false</w:t>
+        <w:t xml:space="preserve">     estTrouve &lt;- false</w:t>
       </w:r>
       <w:r>
         <w:br/>
@@ -1303,35 +965,7 @@
         <w:rPr>
           <w:color w:val="00B050"/>
         </w:rPr>
-        <w:t xml:space="preserve">. Si le nombre est trouvé, alors on affiche le numéro de ligne et de colonne, et on assigne </w:t>
-      </w:r>
-      <w:proofErr w:type="spellStart"/>
-      <w:r>
-        <w:rPr>
-          <w:color w:val="00B050"/>
-        </w:rPr>
-        <w:t>true</w:t>
-      </w:r>
-      <w:proofErr w:type="spellEnd"/>
-      <w:r>
-        <w:rPr>
-          <w:color w:val="00B050"/>
-        </w:rPr>
-        <w:t xml:space="preserve"> à </w:t>
-      </w:r>
-      <w:proofErr w:type="spellStart"/>
-      <w:r>
-        <w:rPr>
-          <w:color w:val="00B050"/>
-        </w:rPr>
-        <w:t>estTrouve</w:t>
-      </w:r>
-      <w:proofErr w:type="spellEnd"/>
-      <w:r>
-        <w:rPr>
-          <w:color w:val="00B050"/>
-        </w:rPr>
-        <w:t xml:space="preserve"> </w:t>
+        <w:t xml:space="preserve">. Si le nombre est trouvé, alors on affiche le numéro de ligne et de colonne, et on assigne true à estTrouve </w:t>
       </w:r>
     </w:p>
     <w:p>
@@ -1391,23 +1025,8 @@
         </w:numPr>
       </w:pPr>
       <w:r>
-        <w:t xml:space="preserve">           </w:t>
-      </w:r>
-      <w:proofErr w:type="spellStart"/>
-      <w:proofErr w:type="gramStart"/>
-      <w:r>
-        <w:t>estTrouve</w:t>
-      </w:r>
-      <w:proofErr w:type="spellEnd"/>
-      <w:proofErr w:type="gramEnd"/>
-      <w:r>
-        <w:t xml:space="preserve"> &lt;- </w:t>
-      </w:r>
-      <w:proofErr w:type="spellStart"/>
-      <w:r>
-        <w:t>true</w:t>
-      </w:r>
-      <w:proofErr w:type="spellEnd"/>
+        <w:t xml:space="preserve">           estTrouve &lt;- true</w:t>
+      </w:r>
     </w:p>
     <w:p>
       <w:pPr>
@@ -1463,21 +1082,7 @@
         <w:rPr>
           <w:color w:val="00B050"/>
         </w:rPr>
-        <w:t xml:space="preserve">//Une fois le tableau parcouru si </w:t>
-      </w:r>
-      <w:proofErr w:type="spellStart"/>
-      <w:r>
-        <w:rPr>
-          <w:color w:val="00B050"/>
-        </w:rPr>
-        <w:t>estTrouve</w:t>
-      </w:r>
-      <w:proofErr w:type="spellEnd"/>
-      <w:r>
-        <w:rPr>
-          <w:color w:val="00B050"/>
-        </w:rPr>
-        <w:t xml:space="preserve"> est toujours à false, alors le nombre n’existe pas dans le tableau, et donc on affiche le message correspondant</w:t>
+        <w:t>//Une fois le tableau parcouru si estTrouve est toujours à false, alors le nombre n’existe pas dans le tableau, et donc on affiche le message correspondant</w:t>
       </w:r>
     </w:p>
     <w:p>
@@ -1495,21 +1100,7 @@
         <w:rPr>
           <w:color w:val="auto"/>
         </w:rPr>
-        <w:t xml:space="preserve">Si </w:t>
-      </w:r>
-      <w:proofErr w:type="spellStart"/>
-      <w:r>
-        <w:rPr>
-          <w:color w:val="auto"/>
-        </w:rPr>
-        <w:t>estTrouve</w:t>
-      </w:r>
-      <w:proofErr w:type="spellEnd"/>
-      <w:r>
-        <w:rPr>
-          <w:color w:val="auto"/>
-        </w:rPr>
-        <w:t xml:space="preserve"> est false</w:t>
+        <w:t>Si estTrouve est false</w:t>
       </w:r>
     </w:p>
     <w:p>
@@ -1968,7 +1559,6 @@
                               <w:szCs w:val="22"/>
                             </w:rPr>
                           </w:pPr>
-                          <w:proofErr w:type="gramStart"/>
                           <w:r>
                             <w:rPr>
                               <w:rFonts w:ascii="Arial" w:hAnsi="Arial" w:cs="Arial"/>
@@ -1977,7 +1567,6 @@
                             </w:rPr>
                             <w:t>xx</w:t>
                           </w:r>
-                          <w:proofErr w:type="gramEnd"/>
                           <w:r>
                             <w:rPr>
                               <w:rFonts w:ascii="Arial" w:hAnsi="Arial" w:cs="Arial"/>
@@ -2045,7 +1634,6 @@
                         <w:szCs w:val="22"/>
                       </w:rPr>
                     </w:pPr>
-                    <w:proofErr w:type="gramStart"/>
                     <w:r>
                       <w:rPr>
                         <w:rFonts w:ascii="Arial" w:hAnsi="Arial" w:cs="Arial"/>
@@ -2054,7 +1642,6 @@
                       </w:rPr>
                       <w:t>xx</w:t>
                     </w:r>
-                    <w:proofErr w:type="gramEnd"/>
                     <w:r>
                       <w:rPr>
                         <w:rFonts w:ascii="Arial" w:hAnsi="Arial" w:cs="Arial"/>
@@ -2144,7 +1731,6 @@
                               <w:szCs w:val="22"/>
                             </w:rPr>
                           </w:pPr>
-                          <w:proofErr w:type="gramStart"/>
                           <w:r>
                             <w:rPr>
                               <w:rFonts w:ascii="Arial" w:hAnsi="Arial" w:cs="Arial"/>
@@ -2153,7 +1739,6 @@
                             </w:rPr>
                             <w:t>xx</w:t>
                           </w:r>
-                          <w:proofErr w:type="gramEnd"/>
                           <w:r>
                             <w:rPr>
                               <w:rFonts w:ascii="Arial" w:hAnsi="Arial" w:cs="Arial"/>
@@ -2221,7 +1806,6 @@
                         <w:szCs w:val="22"/>
                       </w:rPr>
                     </w:pPr>
-                    <w:proofErr w:type="gramStart"/>
                     <w:r>
                       <w:rPr>
                         <w:rFonts w:ascii="Arial" w:hAnsi="Arial" w:cs="Arial"/>
@@ -2230,7 +1814,6 @@
                       </w:rPr>
                       <w:t>xx</w:t>
                     </w:r>
-                    <w:proofErr w:type="gramEnd"/>
                     <w:r>
                       <w:rPr>
                         <w:rFonts w:ascii="Arial" w:hAnsi="Arial" w:cs="Arial"/>

</xml_diff>